<commit_message>
clean up extra files and save final report with Table of Contents
</commit_message>
<xml_diff>
--- a/docs/project_report.docx
+++ b/docs/project_report.docx
@@ -172,7 +172,17 @@
           <w:color w:val="2874A6"/>
           <w:sz w:val="20"/>
         </w:rPr>
-        <w:t>GitHub Repository: [INSERT GITHUB URL HERE]</w:t>
+        <w:t xml:space="preserve">GitHub Repository: </w:t>
+      </w:r>
+      <w:r>
+        <w:rPr>
+          <w:rFonts w:hint="default" w:ascii="Consolas" w:hAnsi="Consolas"/>
+          <w:b/>
+          <w:bCs/>
+          <w:color w:val="2874A6"/>
+          <w:sz w:val="20"/>
+        </w:rPr>
+        <w:t>https://github.com/ZubairGhaffar/Advanced_DBMS_Project</w:t>
       </w:r>
       <w:r>
         <w:rPr>
@@ -182,14 +192,6 @@
         </w:rPr>
         <w:br w:type="textWrapping"/>
       </w:r>
-      <w:r>
-        <w:rPr>
-          <w:rFonts w:ascii="Consolas" w:hAnsi="Consolas"/>
-          <w:color w:val="2874A6"/>
-          <w:sz w:val="20"/>
-        </w:rPr>
-        <w:t>Live Application URL: [INSERT LIVE DEPLOYMENT URL HERE]</w:t>
-      </w:r>
     </w:p>
     <w:p>
       <w:r>
@@ -202,10 +204,12 @@
         <w:keepNext/>
         <w:spacing w:before="360" w:after="200"/>
       </w:pPr>
+      <w:bookmarkStart w:id="0" w:name="_GoBack"/>
       <w:r>
         <w:t>Table of Contents</w:t>
       </w:r>
     </w:p>
+    <w:bookmarkEnd w:id="0"/>
     <w:p>
       <w:pPr>
         <w:spacing w:after="120" w:line="276" w:lineRule="auto"/>
@@ -2333,6 +2337,14 @@
         <w:gridCol w:w="9360"/>
       </w:tblGrid>
       <w:tr>
+        <w:tblPrEx>
+          <w:tblCellMar>
+            <w:top w:w="0" w:type="dxa"/>
+            <w:left w:w="108" w:type="dxa"/>
+            <w:bottom w:w="0" w:type="dxa"/>
+            <w:right w:w="108" w:type="dxa"/>
+          </w:tblCellMar>
+        </w:tblPrEx>
         <w:trPr>
           <w:jc w:val="center"/>
         </w:trPr>
@@ -3464,6 +3476,14 @@
         <w:gridCol w:w="9360"/>
       </w:tblGrid>
       <w:tr>
+        <w:tblPrEx>
+          <w:tblCellMar>
+            <w:top w:w="0" w:type="dxa"/>
+            <w:left w:w="108" w:type="dxa"/>
+            <w:bottom w:w="0" w:type="dxa"/>
+            <w:right w:w="108" w:type="dxa"/>
+          </w:tblCellMar>
+        </w:tblPrEx>
         <w:trPr>
           <w:jc w:val="center"/>
         </w:trPr>
@@ -5689,8 +5709,6 @@
       <w:r>
         <w:br w:type="page"/>
       </w:r>
-      <w:bookmarkStart w:id="0" w:name="_GoBack"/>
-      <w:bookmarkEnd w:id="0"/>
     </w:p>
     <w:p>
       <w:pPr>
@@ -6122,11 +6140,11 @@
     <w:lsdException w:uiPriority="99" w:name="endnote reference"/>
     <w:lsdException w:uiPriority="99" w:name="endnote text"/>
     <w:lsdException w:uiPriority="99" w:name="table of authorities"/>
-    <w:lsdException w:uiPriority="99" w:semiHidden="0" w:name="macro"/>
+    <w:lsdException w:qFormat="1" w:uiPriority="99" w:semiHidden="0" w:name="macro"/>
     <w:lsdException w:uiPriority="99" w:name="toa heading"/>
     <w:lsdException w:qFormat="1" w:uiPriority="99" w:semiHidden="0" w:name="List"/>
     <w:lsdException w:uiPriority="99" w:semiHidden="0" w:name="List Bullet"/>
-    <w:lsdException w:uiPriority="99" w:semiHidden="0" w:name="List Number"/>
+    <w:lsdException w:qFormat="1" w:uiPriority="99" w:semiHidden="0" w:name="List Number"/>
     <w:lsdException w:qFormat="1" w:uiPriority="99" w:semiHidden="0" w:name="List 2"/>
     <w:lsdException w:uiPriority="99" w:semiHidden="0" w:name="List 3"/>
     <w:lsdException w:uiPriority="99" w:name="List 4"/>
@@ -6136,7 +6154,7 @@
     <w:lsdException w:uiPriority="99" w:name="List Bullet 4"/>
     <w:lsdException w:uiPriority="99" w:name="List Bullet 5"/>
     <w:lsdException w:qFormat="1" w:uiPriority="99" w:semiHidden="0" w:name="List Number 2"/>
-    <w:lsdException w:uiPriority="99" w:semiHidden="0" w:name="List Number 3"/>
+    <w:lsdException w:qFormat="1" w:uiPriority="99" w:semiHidden="0" w:name="List Number 3"/>
     <w:lsdException w:uiPriority="99" w:name="List Number 4"/>
     <w:lsdException w:uiPriority="99" w:name="List Number 5"/>
     <w:lsdException w:qFormat="1" w:unhideWhenUsed="0" w:uiPriority="10" w:semiHidden="0" w:name="Title"/>
@@ -6146,7 +6164,7 @@
     <w:lsdException w:qFormat="1" w:uiPriority="99" w:semiHidden="0" w:name="Body Text"/>
     <w:lsdException w:uiPriority="99" w:name="Body Text Indent"/>
     <w:lsdException w:qFormat="1" w:uiPriority="99" w:semiHidden="0" w:name="List Continue"/>
-    <w:lsdException w:uiPriority="99" w:semiHidden="0" w:name="List Continue 2"/>
+    <w:lsdException w:qFormat="1" w:uiPriority="99" w:semiHidden="0" w:name="List Continue 2"/>
     <w:lsdException w:qFormat="1" w:uiPriority="99" w:semiHidden="0" w:name="List Continue 3"/>
     <w:lsdException w:uiPriority="99" w:name="List Continue 4"/>
     <w:lsdException w:uiPriority="99" w:name="List Continue 5"/>
@@ -6229,70 +6247,70 @@
     <w:lsdException w:uiPriority="99" w:name="Table Theme"/>
     <w:lsdException w:qFormat="1" w:unhideWhenUsed="0" w:uiPriority="1" w:semiHidden="0" w:name="No Spacing"/>
     <w:lsdException w:qFormat="1" w:unhideWhenUsed="0" w:uiPriority="60" w:semiHidden="0" w:name="Light Shading"/>
-    <w:lsdException w:unhideWhenUsed="0" w:uiPriority="61" w:semiHidden="0" w:name="Light List"/>
+    <w:lsdException w:qFormat="1" w:unhideWhenUsed="0" w:uiPriority="61" w:semiHidden="0" w:name="Light List"/>
     <w:lsdException w:qFormat="1" w:unhideWhenUsed="0" w:uiPriority="62" w:semiHidden="0" w:name="Light Grid"/>
     <w:lsdException w:qFormat="1" w:unhideWhenUsed="0" w:uiPriority="63" w:semiHidden="0" w:name="Medium Shading 1"/>
     <w:lsdException w:qFormat="1" w:unhideWhenUsed="0" w:uiPriority="64" w:semiHidden="0" w:name="Medium Shading 2"/>
     <w:lsdException w:qFormat="1" w:unhideWhenUsed="0" w:uiPriority="65" w:semiHidden="0" w:name="Medium List 1"/>
-    <w:lsdException w:unhideWhenUsed="0" w:uiPriority="66" w:semiHidden="0" w:name="Medium List 2"/>
-    <w:lsdException w:unhideWhenUsed="0" w:uiPriority="67" w:semiHidden="0" w:name="Medium Grid 1"/>
+    <w:lsdException w:qFormat="1" w:unhideWhenUsed="0" w:uiPriority="66" w:semiHidden="0" w:name="Medium List 2"/>
+    <w:lsdException w:qFormat="1" w:unhideWhenUsed="0" w:uiPriority="67" w:semiHidden="0" w:name="Medium Grid 1"/>
     <w:lsdException w:qFormat="1" w:unhideWhenUsed="0" w:uiPriority="68" w:semiHidden="0" w:name="Medium Grid 2"/>
     <w:lsdException w:qFormat="1" w:unhideWhenUsed="0" w:uiPriority="69" w:semiHidden="0" w:name="Medium Grid 3"/>
     <w:lsdException w:qFormat="1" w:unhideWhenUsed="0" w:uiPriority="70" w:semiHidden="0" w:name="Dark List"/>
     <w:lsdException w:qFormat="1" w:unhideWhenUsed="0" w:uiPriority="71" w:semiHidden="0" w:name="Colorful Shading"/>
     <w:lsdException w:qFormat="1" w:unhideWhenUsed="0" w:uiPriority="72" w:semiHidden="0" w:name="Colorful List"/>
     <w:lsdException w:qFormat="1" w:unhideWhenUsed="0" w:uiPriority="73" w:semiHidden="0" w:name="Colorful Grid"/>
-    <w:lsdException w:unhideWhenUsed="0" w:uiPriority="60" w:semiHidden="0" w:name="Light Shading Accent 1"/>
+    <w:lsdException w:qFormat="1" w:unhideWhenUsed="0" w:uiPriority="60" w:semiHidden="0" w:name="Light Shading Accent 1"/>
     <w:lsdException w:qFormat="1" w:unhideWhenUsed="0" w:uiPriority="61" w:semiHidden="0" w:name="Light List Accent 1"/>
     <w:lsdException w:qFormat="1" w:unhideWhenUsed="0" w:uiPriority="62" w:semiHidden="0" w:name="Light Grid Accent 1"/>
-    <w:lsdException w:unhideWhenUsed="0" w:uiPriority="63" w:semiHidden="0" w:name="Medium Shading 1 Accent 1"/>
-    <w:lsdException w:unhideWhenUsed="0" w:uiPriority="64" w:semiHidden="0" w:name="Medium Shading 2 Accent 1"/>
+    <w:lsdException w:qFormat="1" w:unhideWhenUsed="0" w:uiPriority="63" w:semiHidden="0" w:name="Medium Shading 1 Accent 1"/>
+    <w:lsdException w:qFormat="1" w:unhideWhenUsed="0" w:uiPriority="64" w:semiHidden="0" w:name="Medium Shading 2 Accent 1"/>
     <w:lsdException w:qFormat="1" w:unhideWhenUsed="0" w:uiPriority="65" w:semiHidden="0" w:name="Medium List 1 Accent 1"/>
     <w:lsdException w:qFormat="1" w:unhideWhenUsed="0" w:uiPriority="34" w:semiHidden="0" w:name="List Paragraph"/>
     <w:lsdException w:qFormat="1" w:unhideWhenUsed="0" w:uiPriority="29" w:semiHidden="0" w:name="Quote"/>
     <w:lsdException w:qFormat="1" w:unhideWhenUsed="0" w:uiPriority="30" w:semiHidden="0" w:name="Intense Quote"/>
-    <w:lsdException w:unhideWhenUsed="0" w:uiPriority="66" w:semiHidden="0" w:name="Medium List 2 Accent 1"/>
+    <w:lsdException w:qFormat="1" w:unhideWhenUsed="0" w:uiPriority="66" w:semiHidden="0" w:name="Medium List 2 Accent 1"/>
     <w:lsdException w:qFormat="1" w:unhideWhenUsed="0" w:uiPriority="67" w:semiHidden="0" w:name="Medium Grid 1 Accent 1"/>
     <w:lsdException w:qFormat="1" w:unhideWhenUsed="0" w:uiPriority="68" w:semiHidden="0" w:name="Medium Grid 2 Accent 1"/>
-    <w:lsdException w:unhideWhenUsed="0" w:uiPriority="69" w:semiHidden="0" w:name="Medium Grid 3 Accent 1"/>
+    <w:lsdException w:qFormat="1" w:unhideWhenUsed="0" w:uiPriority="69" w:semiHidden="0" w:name="Medium Grid 3 Accent 1"/>
     <w:lsdException w:qFormat="1" w:unhideWhenUsed="0" w:uiPriority="70" w:semiHidden="0" w:name="Dark List Accent 1"/>
     <w:lsdException w:qFormat="1" w:unhideWhenUsed="0" w:uiPriority="71" w:semiHidden="0" w:name="Colorful Shading Accent 1"/>
-    <w:lsdException w:unhideWhenUsed="0" w:uiPriority="72" w:semiHidden="0" w:name="Colorful List Accent 1"/>
+    <w:lsdException w:qFormat="1" w:unhideWhenUsed="0" w:uiPriority="72" w:semiHidden="0" w:name="Colorful List Accent 1"/>
     <w:lsdException w:qFormat="1" w:unhideWhenUsed="0" w:uiPriority="73" w:semiHidden="0" w:name="Colorful Grid Accent 1"/>
     <w:lsdException w:qFormat="1" w:unhideWhenUsed="0" w:uiPriority="60" w:semiHidden="0" w:name="Light Shading Accent 2"/>
     <w:lsdException w:qFormat="1" w:unhideWhenUsed="0" w:uiPriority="61" w:semiHidden="0" w:name="Light List Accent 2"/>
-    <w:lsdException w:unhideWhenUsed="0" w:uiPriority="62" w:semiHidden="0" w:name="Light Grid Accent 2"/>
-    <w:lsdException w:unhideWhenUsed="0" w:uiPriority="63" w:semiHidden="0" w:name="Medium Shading 1 Accent 2"/>
-    <w:lsdException w:unhideWhenUsed="0" w:uiPriority="64" w:semiHidden="0" w:name="Medium Shading 2 Accent 2"/>
+    <w:lsdException w:qFormat="1" w:unhideWhenUsed="0" w:uiPriority="62" w:semiHidden="0" w:name="Light Grid Accent 2"/>
+    <w:lsdException w:qFormat="1" w:unhideWhenUsed="0" w:uiPriority="63" w:semiHidden="0" w:name="Medium Shading 1 Accent 2"/>
+    <w:lsdException w:qFormat="1" w:unhideWhenUsed="0" w:uiPriority="64" w:semiHidden="0" w:name="Medium Shading 2 Accent 2"/>
     <w:lsdException w:qFormat="1" w:unhideWhenUsed="0" w:uiPriority="65" w:semiHidden="0" w:name="Medium List 1 Accent 2"/>
     <w:lsdException w:qFormat="1" w:unhideWhenUsed="0" w:uiPriority="66" w:semiHidden="0" w:name="Medium List 2 Accent 2"/>
     <w:lsdException w:qFormat="1" w:unhideWhenUsed="0" w:uiPriority="67" w:semiHidden="0" w:name="Medium Grid 1 Accent 2"/>
-    <w:lsdException w:unhideWhenUsed="0" w:uiPriority="68" w:semiHidden="0" w:name="Medium Grid 2 Accent 2"/>
-    <w:lsdException w:unhideWhenUsed="0" w:uiPriority="69" w:semiHidden="0" w:name="Medium Grid 3 Accent 2"/>
-    <w:lsdException w:unhideWhenUsed="0" w:uiPriority="70" w:semiHidden="0" w:name="Dark List Accent 2"/>
+    <w:lsdException w:qFormat="1" w:unhideWhenUsed="0" w:uiPriority="68" w:semiHidden="0" w:name="Medium Grid 2 Accent 2"/>
+    <w:lsdException w:qFormat="1" w:unhideWhenUsed="0" w:uiPriority="69" w:semiHidden="0" w:name="Medium Grid 3 Accent 2"/>
+    <w:lsdException w:qFormat="1" w:unhideWhenUsed="0" w:uiPriority="70" w:semiHidden="0" w:name="Dark List Accent 2"/>
     <w:lsdException w:qFormat="1" w:unhideWhenUsed="0" w:uiPriority="71" w:semiHidden="0" w:name="Colorful Shading Accent 2"/>
     <w:lsdException w:qFormat="1" w:unhideWhenUsed="0" w:uiPriority="72" w:semiHidden="0" w:name="Colorful List Accent 2"/>
-    <w:lsdException w:unhideWhenUsed="0" w:uiPriority="73" w:semiHidden="0" w:name="Colorful Grid Accent 2"/>
+    <w:lsdException w:qFormat="1" w:unhideWhenUsed="0" w:uiPriority="73" w:semiHidden="0" w:name="Colorful Grid Accent 2"/>
     <w:lsdException w:qFormat="1" w:unhideWhenUsed="0" w:uiPriority="60" w:semiHidden="0" w:name="Light Shading Accent 3"/>
-    <w:lsdException w:unhideWhenUsed="0" w:uiPriority="61" w:semiHidden="0" w:name="Light List Accent 3"/>
+    <w:lsdException w:qFormat="1" w:unhideWhenUsed="0" w:uiPriority="61" w:semiHidden="0" w:name="Light List Accent 3"/>
     <w:lsdException w:qFormat="1" w:unhideWhenUsed="0" w:uiPriority="62" w:semiHidden="0" w:name="Light Grid Accent 3"/>
     <w:lsdException w:qFormat="1" w:unhideWhenUsed="0" w:uiPriority="63" w:semiHidden="0" w:name="Medium Shading 1 Accent 3"/>
-    <w:lsdException w:unhideWhenUsed="0" w:uiPriority="64" w:semiHidden="0" w:name="Medium Shading 2 Accent 3"/>
+    <w:lsdException w:qFormat="1" w:unhideWhenUsed="0" w:uiPriority="64" w:semiHidden="0" w:name="Medium Shading 2 Accent 3"/>
     <w:lsdException w:qFormat="1" w:unhideWhenUsed="0" w:uiPriority="65" w:semiHidden="0" w:name="Medium List 1 Accent 3"/>
     <w:lsdException w:qFormat="1" w:unhideWhenUsed="0" w:uiPriority="66" w:semiHidden="0" w:name="Medium List 2 Accent 3"/>
     <w:lsdException w:qFormat="1" w:unhideWhenUsed="0" w:uiPriority="67" w:semiHidden="0" w:name="Medium Grid 1 Accent 3"/>
     <w:lsdException w:qFormat="1" w:unhideWhenUsed="0" w:uiPriority="68" w:semiHidden="0" w:name="Medium Grid 2 Accent 3"/>
-    <w:lsdException w:unhideWhenUsed="0" w:uiPriority="69" w:semiHidden="0" w:name="Medium Grid 3 Accent 3"/>
-    <w:lsdException w:unhideWhenUsed="0" w:uiPriority="70" w:semiHidden="0" w:name="Dark List Accent 3"/>
+    <w:lsdException w:qFormat="1" w:unhideWhenUsed="0" w:uiPriority="69" w:semiHidden="0" w:name="Medium Grid 3 Accent 3"/>
+    <w:lsdException w:qFormat="1" w:unhideWhenUsed="0" w:uiPriority="70" w:semiHidden="0" w:name="Dark List Accent 3"/>
     <w:lsdException w:qFormat="1" w:unhideWhenUsed="0" w:uiPriority="71" w:semiHidden="0" w:name="Colorful Shading Accent 3"/>
     <w:lsdException w:qFormat="1" w:unhideWhenUsed="0" w:uiPriority="72" w:semiHidden="0" w:name="Colorful List Accent 3"/>
     <w:lsdException w:qFormat="1" w:unhideWhenUsed="0" w:uiPriority="73" w:semiHidden="0" w:name="Colorful Grid Accent 3"/>
-    <w:lsdException w:unhideWhenUsed="0" w:uiPriority="60" w:semiHidden="0" w:name="Light Shading Accent 4"/>
+    <w:lsdException w:qFormat="1" w:unhideWhenUsed="0" w:uiPriority="60" w:semiHidden="0" w:name="Light Shading Accent 4"/>
     <w:lsdException w:qFormat="1" w:unhideWhenUsed="0" w:uiPriority="61" w:semiHidden="0" w:name="Light List Accent 4"/>
     <w:lsdException w:qFormat="1" w:unhideWhenUsed="0" w:uiPriority="62" w:semiHidden="0" w:name="Light Grid Accent 4"/>
-    <w:lsdException w:unhideWhenUsed="0" w:uiPriority="63" w:semiHidden="0" w:name="Medium Shading 1 Accent 4"/>
-    <w:lsdException w:unhideWhenUsed="0" w:uiPriority="64" w:semiHidden="0" w:name="Medium Shading 2 Accent 4"/>
-    <w:lsdException w:unhideWhenUsed="0" w:uiPriority="65" w:semiHidden="0" w:name="Medium List 1 Accent 4"/>
+    <w:lsdException w:qFormat="1" w:unhideWhenUsed="0" w:uiPriority="63" w:semiHidden="0" w:name="Medium Shading 1 Accent 4"/>
+    <w:lsdException w:qFormat="1" w:unhideWhenUsed="0" w:uiPriority="64" w:semiHidden="0" w:name="Medium Shading 2 Accent 4"/>
+    <w:lsdException w:qFormat="1" w:unhideWhenUsed="0" w:uiPriority="65" w:semiHidden="0" w:name="Medium List 1 Accent 4"/>
     <w:lsdException w:qFormat="1" w:unhideWhenUsed="0" w:uiPriority="66" w:semiHidden="0" w:name="Medium List 2 Accent 4"/>
     <w:lsdException w:qFormat="1" w:unhideWhenUsed="0" w:uiPriority="67" w:semiHidden="0" w:name="Medium Grid 1 Accent 4"/>
     <w:lsdException w:qFormat="1" w:unhideWhenUsed="0" w:uiPriority="68" w:semiHidden="0" w:name="Medium Grid 2 Accent 4"/>
@@ -6301,34 +6319,34 @@
     <w:lsdException w:qFormat="1" w:unhideWhenUsed="0" w:uiPriority="71" w:semiHidden="0" w:name="Colorful Shading Accent 4"/>
     <w:lsdException w:qFormat="1" w:unhideWhenUsed="0" w:uiPriority="72" w:semiHidden="0" w:name="Colorful List Accent 4"/>
     <w:lsdException w:qFormat="1" w:unhideWhenUsed="0" w:uiPriority="73" w:semiHidden="0" w:name="Colorful Grid Accent 4"/>
-    <w:lsdException w:unhideWhenUsed="0" w:uiPriority="60" w:semiHidden="0" w:name="Light Shading Accent 5"/>
-    <w:lsdException w:unhideWhenUsed="0" w:uiPriority="61" w:semiHidden="0" w:name="Light List Accent 5"/>
-    <w:lsdException w:unhideWhenUsed="0" w:uiPriority="62" w:semiHidden="0" w:name="Light Grid Accent 5"/>
-    <w:lsdException w:unhideWhenUsed="0" w:uiPriority="63" w:semiHidden="0" w:name="Medium Shading 1 Accent 5"/>
+    <w:lsdException w:qFormat="1" w:unhideWhenUsed="0" w:uiPriority="60" w:semiHidden="0" w:name="Light Shading Accent 5"/>
+    <w:lsdException w:qFormat="1" w:unhideWhenUsed="0" w:uiPriority="61" w:semiHidden="0" w:name="Light List Accent 5"/>
+    <w:lsdException w:qFormat="1" w:unhideWhenUsed="0" w:uiPriority="62" w:semiHidden="0" w:name="Light Grid Accent 5"/>
+    <w:lsdException w:qFormat="1" w:unhideWhenUsed="0" w:uiPriority="63" w:semiHidden="0" w:name="Medium Shading 1 Accent 5"/>
     <w:lsdException w:qFormat="1" w:unhideWhenUsed="0" w:uiPriority="64" w:semiHidden="0" w:name="Medium Shading 2 Accent 5"/>
-    <w:lsdException w:unhideWhenUsed="0" w:uiPriority="65" w:semiHidden="0" w:name="Medium List 1 Accent 5"/>
-    <w:lsdException w:unhideWhenUsed="0" w:uiPriority="66" w:semiHidden="0" w:name="Medium List 2 Accent 5"/>
-    <w:lsdException w:unhideWhenUsed="0" w:uiPriority="67" w:semiHidden="0" w:name="Medium Grid 1 Accent 5"/>
-    <w:lsdException w:unhideWhenUsed="0" w:uiPriority="68" w:semiHidden="0" w:name="Medium Grid 2 Accent 5"/>
+    <w:lsdException w:qFormat="1" w:unhideWhenUsed="0" w:uiPriority="65" w:semiHidden="0" w:name="Medium List 1 Accent 5"/>
+    <w:lsdException w:qFormat="1" w:unhideWhenUsed="0" w:uiPriority="66" w:semiHidden="0" w:name="Medium List 2 Accent 5"/>
+    <w:lsdException w:qFormat="1" w:unhideWhenUsed="0" w:uiPriority="67" w:semiHidden="0" w:name="Medium Grid 1 Accent 5"/>
+    <w:lsdException w:qFormat="1" w:unhideWhenUsed="0" w:uiPriority="68" w:semiHidden="0" w:name="Medium Grid 2 Accent 5"/>
     <w:lsdException w:qFormat="1" w:unhideWhenUsed="0" w:uiPriority="69" w:semiHidden="0" w:name="Medium Grid 3 Accent 5"/>
-    <w:lsdException w:unhideWhenUsed="0" w:uiPriority="70" w:semiHidden="0" w:name="Dark List Accent 5"/>
+    <w:lsdException w:qFormat="1" w:unhideWhenUsed="0" w:uiPriority="70" w:semiHidden="0" w:name="Dark List Accent 5"/>
     <w:lsdException w:qFormat="1" w:unhideWhenUsed="0" w:uiPriority="71" w:semiHidden="0" w:name="Colorful Shading Accent 5"/>
     <w:lsdException w:qFormat="1" w:unhideWhenUsed="0" w:uiPriority="72" w:semiHidden="0" w:name="Colorful List Accent 5"/>
     <w:lsdException w:qFormat="1" w:unhideWhenUsed="0" w:uiPriority="73" w:semiHidden="0" w:name="Colorful Grid Accent 5"/>
     <w:lsdException w:qFormat="1" w:unhideWhenUsed="0" w:uiPriority="60" w:semiHidden="0" w:name="Light Shading Accent 6"/>
     <w:lsdException w:qFormat="1" w:unhideWhenUsed="0" w:uiPriority="61" w:semiHidden="0" w:name="Light List Accent 6"/>
-    <w:lsdException w:unhideWhenUsed="0" w:uiPriority="62" w:semiHidden="0" w:name="Light Grid Accent 6"/>
+    <w:lsdException w:qFormat="1" w:unhideWhenUsed="0" w:uiPriority="62" w:semiHidden="0" w:name="Light Grid Accent 6"/>
     <w:lsdException w:qFormat="1" w:unhideWhenUsed="0" w:uiPriority="63" w:semiHidden="0" w:name="Medium Shading 1 Accent 6"/>
-    <w:lsdException w:unhideWhenUsed="0" w:uiPriority="64" w:semiHidden="0" w:name="Medium Shading 2 Accent 6"/>
-    <w:lsdException w:unhideWhenUsed="0" w:uiPriority="65" w:semiHidden="0" w:name="Medium List 1 Accent 6"/>
+    <w:lsdException w:qFormat="1" w:unhideWhenUsed="0" w:uiPriority="64" w:semiHidden="0" w:name="Medium Shading 2 Accent 6"/>
+    <w:lsdException w:qFormat="1" w:unhideWhenUsed="0" w:uiPriority="65" w:semiHidden="0" w:name="Medium List 1 Accent 6"/>
     <w:lsdException w:qFormat="1" w:unhideWhenUsed="0" w:uiPriority="66" w:semiHidden="0" w:name="Medium List 2 Accent 6"/>
     <w:lsdException w:qFormat="1" w:unhideWhenUsed="0" w:uiPriority="67" w:semiHidden="0" w:name="Medium Grid 1 Accent 6"/>
-    <w:lsdException w:unhideWhenUsed="0" w:uiPriority="68" w:semiHidden="0" w:name="Medium Grid 2 Accent 6"/>
-    <w:lsdException w:unhideWhenUsed="0" w:uiPriority="69" w:semiHidden="0" w:name="Medium Grid 3 Accent 6"/>
-    <w:lsdException w:unhideWhenUsed="0" w:uiPriority="70" w:semiHidden="0" w:name="Dark List Accent 6"/>
+    <w:lsdException w:qFormat="1" w:unhideWhenUsed="0" w:uiPriority="68" w:semiHidden="0" w:name="Medium Grid 2 Accent 6"/>
+    <w:lsdException w:qFormat="1" w:unhideWhenUsed="0" w:uiPriority="69" w:semiHidden="0" w:name="Medium Grid 3 Accent 6"/>
+    <w:lsdException w:qFormat="1" w:unhideWhenUsed="0" w:uiPriority="70" w:semiHidden="0" w:name="Dark List Accent 6"/>
     <w:lsdException w:qFormat="1" w:unhideWhenUsed="0" w:uiPriority="71" w:semiHidden="0" w:name="Colorful Shading Accent 6"/>
-    <w:lsdException w:unhideWhenUsed="0" w:uiPriority="72" w:semiHidden="0" w:name="Colorful List Accent 6"/>
-    <w:lsdException w:unhideWhenUsed="0" w:uiPriority="73" w:semiHidden="0" w:name="Colorful Grid Accent 6"/>
+    <w:lsdException w:qFormat="1" w:unhideWhenUsed="0" w:uiPriority="72" w:semiHidden="0" w:name="Colorful List Accent 6"/>
+    <w:lsdException w:qFormat="1" w:unhideWhenUsed="0" w:uiPriority="73" w:semiHidden="0" w:name="Colorful Grid Accent 6"/>
   </w:latentStyles>
   <w:style w:type="paragraph" w:default="1" w:styleId="1">
     <w:name w:val="Normal"/>
@@ -6794,6 +6812,7 @@
     <w:name w:val="List Continue 2"/>
     <w:basedOn w:val="1"/>
     <w:unhideWhenUsed/>
+    <w:qFormat/>
     <w:uiPriority w:val="99"/>
     <w:pPr>
       <w:spacing w:after="120"/>
@@ -6817,6 +6836,7 @@
     <w:name w:val="List Number"/>
     <w:basedOn w:val="1"/>
     <w:unhideWhenUsed/>
+    <w:qFormat/>
     <w:uiPriority w:val="99"/>
     <w:pPr>
       <w:numPr>
@@ -6844,6 +6864,7 @@
     <w:name w:val="List Number 3"/>
     <w:basedOn w:val="1"/>
     <w:unhideWhenUsed/>
+    <w:qFormat/>
     <w:uiPriority w:val="99"/>
     <w:pPr>
       <w:numPr>
@@ -6857,6 +6878,7 @@
     <w:name w:val="macro"/>
     <w:link w:val="147"/>
     <w:unhideWhenUsed/>
+    <w:qFormat/>
     <w:uiPriority w:val="99"/>
     <w:pPr>
       <w:tabs>
@@ -7060,6 +7082,7 @@
   <w:style w:type="table" w:styleId="38">
     <w:name w:val="Light Shading Accent 1"/>
     <w:basedOn w:val="12"/>
+    <w:qFormat/>
     <w:uiPriority w:val="60"/>
     <w:pPr>
       <w:spacing w:after="0" w:line="240" w:lineRule="auto"/>
@@ -7359,6 +7382,7 @@
   <w:style w:type="table" w:styleId="41">
     <w:name w:val="Light Shading Accent 4"/>
     <w:basedOn w:val="12"/>
+    <w:qFormat/>
     <w:uiPriority w:val="60"/>
     <w:pPr>
       <w:spacing w:after="0" w:line="240" w:lineRule="auto"/>
@@ -7458,6 +7482,7 @@
   <w:style w:type="table" w:styleId="42">
     <w:name w:val="Light Shading Accent 5"/>
     <w:basedOn w:val="12"/>
+    <w:qFormat/>
     <w:uiPriority w:val="60"/>
     <w:pPr>
       <w:spacing w:after="0" w:line="240" w:lineRule="auto"/>
@@ -7657,6 +7682,7 @@
   <w:style w:type="table" w:styleId="44">
     <w:name w:val="Light List"/>
     <w:basedOn w:val="12"/>
+    <w:qFormat/>
     <w:uiPriority w:val="61"/>
     <w:pPr>
       <w:spacing w:after="0" w:line="240" w:lineRule="auto"/>
@@ -7938,6 +7964,7 @@
   <w:style w:type="table" w:styleId="47">
     <w:name w:val="Light List Accent 3"/>
     <w:basedOn w:val="12"/>
+    <w:qFormat/>
     <w:uiPriority w:val="61"/>
     <w:pPr>
       <w:spacing w:after="0" w:line="240" w:lineRule="auto"/>
@@ -8125,6 +8152,7 @@
   <w:style w:type="table" w:styleId="49">
     <w:name w:val="Light List Accent 5"/>
     <w:basedOn w:val="12"/>
+    <w:qFormat/>
     <w:uiPriority w:val="61"/>
     <w:pPr>
       <w:spacing w:after="0" w:line="240" w:lineRule="auto"/>
@@ -8566,6 +8594,7 @@
   <w:style w:type="table" w:styleId="53">
     <w:name w:val="Light Grid Accent 2"/>
     <w:basedOn w:val="12"/>
+    <w:qFormat/>
     <w:uiPriority w:val="62"/>
     <w:pPr>
       <w:spacing w:after="0" w:line="240" w:lineRule="auto"/>
@@ -8946,6 +8975,7 @@
   <w:style w:type="table" w:styleId="56">
     <w:name w:val="Light Grid Accent 5"/>
     <w:basedOn w:val="12"/>
+    <w:qFormat/>
     <w:uiPriority w:val="62"/>
     <w:pPr>
       <w:spacing w:after="0" w:line="240" w:lineRule="auto"/>
@@ -9072,6 +9102,7 @@
   <w:style w:type="table" w:styleId="57">
     <w:name w:val="Light Grid Accent 6"/>
     <w:basedOn w:val="12"/>
+    <w:qFormat/>
     <w:uiPriority w:val="62"/>
     <w:pPr>
       <w:spacing w:after="0" w:line="240" w:lineRule="auto"/>
@@ -9306,6 +9337,7 @@
   <w:style w:type="table" w:styleId="59">
     <w:name w:val="Medium Shading 1 Accent 1"/>
     <w:basedOn w:val="12"/>
+    <w:qFormat/>
     <w:uiPriority w:val="63"/>
     <w:pPr>
       <w:spacing w:after="0" w:line="240" w:lineRule="auto"/>
@@ -9413,6 +9445,7 @@
   <w:style w:type="table" w:styleId="60">
     <w:name w:val="Medium Shading 1 Accent 2"/>
     <w:basedOn w:val="12"/>
+    <w:qFormat/>
     <w:uiPriority w:val="63"/>
     <w:pPr>
       <w:spacing w:after="0" w:line="240" w:lineRule="auto"/>
@@ -9628,6 +9661,7 @@
   <w:style w:type="table" w:styleId="62">
     <w:name w:val="Medium Shading 1 Accent 4"/>
     <w:basedOn w:val="12"/>
+    <w:qFormat/>
     <w:uiPriority w:val="63"/>
     <w:pPr>
       <w:spacing w:after="0" w:line="240" w:lineRule="auto"/>
@@ -9735,6 +9769,7 @@
   <w:style w:type="table" w:styleId="63">
     <w:name w:val="Medium Shading 1 Accent 5"/>
     <w:basedOn w:val="12"/>
+    <w:qFormat/>
     <w:uiPriority w:val="63"/>
     <w:pPr>
       <w:spacing w:after="0" w:line="240" w:lineRule="auto"/>
@@ -10116,6 +10151,7 @@
   <w:style w:type="table" w:styleId="66">
     <w:name w:val="Medium Shading 2 Accent 1"/>
     <w:basedOn w:val="12"/>
+    <w:qFormat/>
     <w:uiPriority w:val="64"/>
     <w:pPr>
       <w:spacing w:after="0" w:line="240" w:lineRule="auto"/>
@@ -10281,6 +10317,7 @@
   <w:style w:type="table" w:styleId="67">
     <w:name w:val="Medium Shading 2 Accent 2"/>
     <w:basedOn w:val="12"/>
+    <w:qFormat/>
     <w:uiPriority w:val="64"/>
     <w:pPr>
       <w:spacing w:after="0" w:line="240" w:lineRule="auto"/>
@@ -10446,6 +10483,7 @@
   <w:style w:type="table" w:styleId="68">
     <w:name w:val="Medium Shading 2 Accent 3"/>
     <w:basedOn w:val="12"/>
+    <w:qFormat/>
     <w:uiPriority w:val="64"/>
     <w:pPr>
       <w:spacing w:after="0" w:line="240" w:lineRule="auto"/>
@@ -10611,6 +10649,7 @@
   <w:style w:type="table" w:styleId="69">
     <w:name w:val="Medium Shading 2 Accent 4"/>
     <w:basedOn w:val="12"/>
+    <w:qFormat/>
     <w:uiPriority w:val="64"/>
     <w:pPr>
       <w:spacing w:after="0" w:line="240" w:lineRule="auto"/>
@@ -10942,6 +10981,7 @@
   <w:style w:type="table" w:styleId="71">
     <w:name w:val="Medium Shading 2 Accent 6"/>
     <w:basedOn w:val="12"/>
+    <w:qFormat/>
     <w:uiPriority w:val="64"/>
     <w:pPr>
       <w:spacing w:after="0" w:line="240" w:lineRule="auto"/>
@@ -11471,6 +11511,7 @@
   <w:style w:type="table" w:styleId="76">
     <w:name w:val="Medium List 1 Accent 4"/>
     <w:basedOn w:val="12"/>
+    <w:qFormat/>
     <w:uiPriority w:val="65"/>
     <w:pPr>
       <w:spacing w:after="0" w:line="240" w:lineRule="auto"/>
@@ -11561,6 +11602,7 @@
   <w:style w:type="table" w:styleId="77">
     <w:name w:val="Medium List 1 Accent 5"/>
     <w:basedOn w:val="12"/>
+    <w:qFormat/>
     <w:uiPriority w:val="65"/>
     <w:pPr>
       <w:spacing w:after="0" w:line="240" w:lineRule="auto"/>
@@ -11651,6 +11693,7 @@
   <w:style w:type="table" w:styleId="78">
     <w:name w:val="Medium List 1 Accent 6"/>
     <w:basedOn w:val="12"/>
+    <w:qFormat/>
     <w:uiPriority w:val="65"/>
     <w:pPr>
       <w:spacing w:after="0" w:line="240" w:lineRule="auto"/>
@@ -11741,6 +11784,7 @@
   <w:style w:type="table" w:styleId="79">
     <w:name w:val="Medium List 2"/>
     <w:basedOn w:val="12"/>
+    <w:qFormat/>
     <w:uiPriority w:val="66"/>
     <w:pPr>
       <w:spacing w:after="0" w:line="240" w:lineRule="auto"/>
@@ -11870,6 +11914,7 @@
   <w:style w:type="table" w:styleId="80">
     <w:name w:val="Medium List 2 Accent 1"/>
     <w:basedOn w:val="12"/>
+    <w:qFormat/>
     <w:uiPriority w:val="66"/>
     <w:pPr>
       <w:spacing w:after="0" w:line="240" w:lineRule="auto"/>
@@ -12389,6 +12434,7 @@
   <w:style w:type="table" w:styleId="84">
     <w:name w:val="Medium List 2 Accent 5"/>
     <w:basedOn w:val="12"/>
+    <w:qFormat/>
     <w:uiPriority w:val="66"/>
     <w:pPr>
       <w:spacing w:after="0" w:line="240" w:lineRule="auto"/>
@@ -12648,6 +12694,7 @@
   <w:style w:type="table" w:styleId="86">
     <w:name w:val="Medium Grid 1"/>
     <w:basedOn w:val="12"/>
+    <w:qFormat/>
     <w:uiPriority w:val="67"/>
     <w:pPr>
       <w:spacing w:after="0" w:line="240" w:lineRule="auto"/>
@@ -12997,6 +13044,7 @@
   <w:style w:type="table" w:styleId="91">
     <w:name w:val="Medium Grid 1 Accent 5"/>
     <w:basedOn w:val="12"/>
+    <w:qFormat/>
     <w:uiPriority w:val="67"/>
     <w:pPr>
       <w:spacing w:after="0" w:line="240" w:lineRule="auto"/>
@@ -13430,6 +13478,7 @@
   <w:style w:type="table" w:styleId="95">
     <w:name w:val="Medium Grid 2 Accent 2"/>
     <w:basedOn w:val="12"/>
+    <w:qFormat/>
     <w:uiPriority w:val="68"/>
     <w:pPr>
       <w:spacing w:after="0" w:line="240" w:lineRule="auto"/>
@@ -13870,6 +13919,7 @@
   <w:style w:type="table" w:styleId="98">
     <w:name w:val="Medium Grid 2 Accent 5"/>
     <w:basedOn w:val="12"/>
+    <w:qFormat/>
     <w:uiPriority w:val="68"/>
     <w:pPr>
       <w:spacing w:after="0" w:line="240" w:lineRule="auto"/>
@@ -14016,6 +14066,7 @@
   <w:style w:type="table" w:styleId="99">
     <w:name w:val="Medium Grid 2 Accent 6"/>
     <w:basedOn w:val="12"/>
+    <w:qFormat/>
     <w:uiPriority w:val="68"/>
     <w:pPr>
       <w:spacing w:after="0" w:line="240" w:lineRule="auto"/>
@@ -14320,6 +14371,7 @@
   <w:style w:type="table" w:styleId="101">
     <w:name w:val="Medium Grid 3 Accent 1"/>
     <w:basedOn w:val="12"/>
+    <w:qFormat/>
     <w:uiPriority w:val="69"/>
     <w:pPr>
       <w:spacing w:after="0" w:line="240" w:lineRule="auto"/>
@@ -14477,6 +14529,7 @@
   <w:style w:type="table" w:styleId="102">
     <w:name w:val="Medium Grid 3 Accent 2"/>
     <w:basedOn w:val="12"/>
+    <w:qFormat/>
     <w:uiPriority w:val="69"/>
     <w:pPr>
       <w:spacing w:after="0" w:line="240" w:lineRule="auto"/>
@@ -14634,6 +14687,7 @@
   <w:style w:type="table" w:styleId="103">
     <w:name w:val="Medium Grid 3 Accent 3"/>
     <w:basedOn w:val="12"/>
+    <w:qFormat/>
     <w:uiPriority w:val="69"/>
     <w:pPr>
       <w:spacing w:after="0" w:line="240" w:lineRule="auto"/>
@@ -15107,6 +15161,7 @@
   <w:style w:type="table" w:styleId="106">
     <w:name w:val="Medium Grid 3 Accent 6"/>
     <w:basedOn w:val="12"/>
+    <w:qFormat/>
     <w:uiPriority w:val="69"/>
     <w:pPr>
       <w:spacing w:after="0" w:line="240" w:lineRule="auto"/>
@@ -15496,6 +15551,7 @@
   <w:style w:type="table" w:styleId="109">
     <w:name w:val="Dark List Accent 2"/>
     <w:basedOn w:val="12"/>
+    <w:qFormat/>
     <w:uiPriority w:val="70"/>
     <w:pPr>
       <w:spacing w:after="0" w:line="240" w:lineRule="auto"/>
@@ -15611,6 +15667,7 @@
   <w:style w:type="table" w:styleId="110">
     <w:name w:val="Dark List Accent 3"/>
     <w:basedOn w:val="12"/>
+    <w:qFormat/>
     <w:uiPriority w:val="70"/>
     <w:pPr>
       <w:spacing w:after="0" w:line="240" w:lineRule="auto"/>
@@ -15842,6 +15899,7 @@
   <w:style w:type="table" w:styleId="112">
     <w:name w:val="Dark List Accent 5"/>
     <w:basedOn w:val="12"/>
+    <w:qFormat/>
     <w:uiPriority w:val="70"/>
     <w:pPr>
       <w:spacing w:after="0" w:line="240" w:lineRule="auto"/>
@@ -15957,6 +16015,7 @@
   <w:style w:type="table" w:styleId="113">
     <w:name w:val="Dark List Accent 6"/>
     <w:basedOn w:val="12"/>
+    <w:qFormat/>
     <w:uiPriority w:val="70"/>
     <w:pPr>
       <w:spacing w:after="0" w:line="240" w:lineRule="auto"/>
@@ -17188,6 +17247,7 @@
   <w:style w:type="table" w:styleId="122">
     <w:name w:val="Colorful List Accent 1"/>
     <w:basedOn w:val="12"/>
+    <w:qFormat/>
     <w:uiPriority w:val="72"/>
     <w:pPr>
       <w:spacing w:after="0" w:line="240" w:lineRule="auto"/>
@@ -17652,6 +17712,7 @@
   <w:style w:type="table" w:styleId="127">
     <w:name w:val="Colorful List Accent 6"/>
     <w:basedOn w:val="12"/>
+    <w:qFormat/>
     <w:uiPriority w:val="72"/>
     <w:pPr>
       <w:spacing w:after="0" w:line="240" w:lineRule="auto"/>
@@ -17938,6 +17999,7 @@
   <w:style w:type="table" w:styleId="130">
     <w:name w:val="Colorful Grid Accent 2"/>
     <w:basedOn w:val="12"/>
+    <w:qFormat/>
     <w:uiPriority w:val="73"/>
     <w:pPr>
       <w:spacing w:after="0" w:line="240" w:lineRule="auto"/>
@@ -18325,6 +18387,7 @@
   <w:style w:type="table" w:styleId="134">
     <w:name w:val="Colorful Grid Accent 6"/>
     <w:basedOn w:val="12"/>
+    <w:qFormat/>
     <w:uiPriority w:val="73"/>
     <w:pPr>
       <w:spacing w:after="0" w:line="240" w:lineRule="auto"/>
@@ -18422,12 +18485,14 @@
     <w:name w:val="Header Char"/>
     <w:basedOn w:val="11"/>
     <w:link w:val="19"/>
+    <w:qFormat/>
     <w:uiPriority w:val="99"/>
   </w:style>
   <w:style w:type="character" w:customStyle="1" w:styleId="136">
     <w:name w:val="Footer Char"/>
     <w:basedOn w:val="11"/>
     <w:link w:val="18"/>
+    <w:qFormat/>
     <w:uiPriority w:val="99"/>
   </w:style>
   <w:style w:type="paragraph" w:styleId="137">
@@ -18448,6 +18513,7 @@
     <w:name w:val="Heading 1 Char"/>
     <w:basedOn w:val="11"/>
     <w:link w:val="2"/>
+    <w:qFormat/>
     <w:uiPriority w:val="9"/>
     <w:rPr>
       <w:rFonts w:asciiTheme="majorHAnsi" w:hAnsiTheme="majorHAnsi" w:eastAsiaTheme="majorEastAsia" w:cstheme="majorBidi"/>
@@ -18546,12 +18612,14 @@
     <w:name w:val="Body Text Char"/>
     <w:basedOn w:val="11"/>
     <w:link w:val="13"/>
+    <w:qFormat/>
     <w:uiPriority w:val="99"/>
   </w:style>
   <w:style w:type="character" w:customStyle="1" w:styleId="145">
     <w:name w:val="Body Text 2 Char"/>
     <w:basedOn w:val="11"/>
     <w:link w:val="14"/>
+    <w:qFormat/>
     <w:uiPriority w:val="99"/>
   </w:style>
   <w:style w:type="character" w:customStyle="1" w:styleId="146">
@@ -18617,6 +18685,7 @@
     <w:basedOn w:val="11"/>
     <w:link w:val="5"/>
     <w:semiHidden/>
+    <w:qFormat/>
     <w:uiPriority w:val="9"/>
     <w:rPr>
       <w:rFonts w:asciiTheme="majorHAnsi" w:hAnsiTheme="majorHAnsi" w:eastAsiaTheme="majorEastAsia" w:cstheme="majorBidi"/>
@@ -18637,6 +18706,7 @@
     <w:basedOn w:val="11"/>
     <w:link w:val="6"/>
     <w:semiHidden/>
+    <w:qFormat/>
     <w:uiPriority w:val="9"/>
     <w:rPr>
       <w:rFonts w:asciiTheme="majorHAnsi" w:hAnsiTheme="majorHAnsi" w:eastAsiaTheme="majorEastAsia" w:cstheme="majorBidi"/>

</xml_diff>